<commit_message>
Update Ryan supervision notes V2 (14 Apr 2026) and add EMDR supervision template
Made-with: Cursor
</commit_message>
<xml_diff>
--- a/Case notes/Clients/Ryan/Supervision notes 14Apr2026.docx
+++ b/Case notes/Clients/Ryan/Supervision notes 14Apr2026.docx
@@ -7,7 +7,7 @@
         <w:pStyle w:val="Title"/>
       </w:pPr>
       <w:r>
-        <w:t>Supervision Notes — 14 April 2026</w:t>
+        <w:t>Supervision Notes — Ryan — 14 April 2026 (V2)</w:t>
       </w:r>
     </w:p>
     <w:p>
@@ -15,12 +15,49 @@
         <w:pStyle w:val="Heading1"/>
       </w:pPr>
       <w:r>
-        <w:t>Client</w:t>
+        <w:t>Client / Supervisor / Clinician</w:t>
       </w:r>
     </w:p>
     <w:p>
+      <w:pPr>
+        <w:pStyle w:val="ListBullet"/>
+      </w:pPr>
       <w:r>
-        <w:t>Ryan</w:t>
+        <w:rPr>
+          <w:b/>
+        </w:rPr>
+        <w:t>Client:</w:t>
+      </w:r>
+      <w:r>
+        <w:t xml:space="preserve"> Ryan</w:t>
+      </w:r>
+    </w:p>
+    <w:p>
+      <w:pPr>
+        <w:pStyle w:val="ListBullet"/>
+      </w:pPr>
+      <w:r>
+        <w:rPr>
+          <w:b/>
+        </w:rPr>
+        <w:t>Supervisor:</w:t>
+      </w:r>
+      <w:r>
+        <w:t xml:space="preserve"> Not named in the verified on-file summary (V4, 03-03-2026).</w:t>
+      </w:r>
+    </w:p>
+    <w:p>
+      <w:pPr>
+        <w:pStyle w:val="ListBullet"/>
+      </w:pPr>
+      <w:r>
+        <w:rPr>
+          <w:b/>
+        </w:rPr>
+        <w:t>Clinician:</w:t>
+      </w:r>
+      <w:r>
+        <w:t xml:space="preserve"> Not named in the verified on-file summary (V4, 03-03-2026).</w:t>
       </w:r>
     </w:p>
     <w:p>
@@ -28,12 +65,7 @@
         <w:pStyle w:val="Heading1"/>
       </w:pPr>
       <w:r>
-        <w:t>Date</w:t>
-      </w:r>
-    </w:p>
-    <w:p>
-      <w:r>
-        <w:t>14 April 2026</w:t>
+        <w:t>Brief Background</w:t>
       </w:r>
     </w:p>
     <w:p>
@@ -41,20 +73,7 @@
         <w:rPr>
           <w:i/>
         </w:rPr>
-        <w:t>Source context for verified clinical content: Ryan – EMDR Supervision Summary V4 – 03-03-2026 (on file in this repository). This note does not record that a supervision session occurred on 14 April 2026; that is not evidenced in repository materials reviewed for this document.</w:t>
-      </w:r>
-    </w:p>
-    <w:p>
-      <w:pPr>
-        <w:pStyle w:val="Heading1"/>
-      </w:pPr>
-      <w:r>
-        <w:t>Brief background summary</w:t>
-      </w:r>
-    </w:p>
-    <w:p>
-      <w:r>
-        <w:t>(As documented in V4, 03-03-2026.)</w:t>
+        <w:t>Verified source: Ryan – EMDR Supervision Summary V4 – 03-03-2026.</w:t>
       </w:r>
     </w:p>
     <w:p>
@@ -62,7 +81,7 @@
         <w:pStyle w:val="ListBullet"/>
       </w:pPr>
       <w:r>
-        <w:t>University student; relationship instability, panic attacks, overthinking.</w:t>
+        <w:t>University student; relationship instability, panic attacks, and overthinking appear in the record.</w:t>
       </w:r>
     </w:p>
     <w:p>
@@ -70,7 +89,7 @@
         <w:pStyle w:val="ListBullet"/>
       </w:pPr>
       <w:r>
-        <w:t>Intrusive violent imagery (ego-dystonic; no intent).</w:t>
+        <w:t>Intrusive violent imagery is documented as ego-dystonic, without intent to act.</w:t>
       </w:r>
     </w:p>
     <w:p>
@@ -78,7 +97,7 @@
         <w:pStyle w:val="ListBullet"/>
       </w:pPr>
       <w:r>
-        <w:t>Awaiting GP referral to Brandon Centre.</w:t>
+        <w:t>GP referral to Brandon Centre is awaited.</w:t>
       </w:r>
     </w:p>
     <w:p>
@@ -90,21 +109,14 @@
       </w:r>
     </w:p>
     <w:p>
-      <w:pPr>
-        <w:pStyle w:val="Heading1"/>
-      </w:pPr>
       <w:r>
-        <w:t>Since last supervision</w:t>
+        <w:rPr>
+          <w:b/>
+        </w:rPr>
+        <w:t>Formulation (condensed attachment model, per V4):</w:t>
       </w:r>
-    </w:p>
-    <w:p>
       <w:r>
-        <w:t>The most recent on-file supervision-oriented case summary in the repository is **V4 — 03 March 2026**.</w:t>
-      </w:r>
-    </w:p>
-    <w:p>
-      <w:r>
-        <w:t>**[TO BE COMPLETED]** — Any sessions, events, or updates between that documented summary and 14 April 2026 that are not already held in this repository.</w:t>
+        <w:t xml:space="preserve"> Father left when client was in Year 2 (attachment rupture). Perceived emotional invalidation from mother (RADA choice). Childhood sibling conflict/bullying. Suppressed rage linked to abandonment themes; shame about anger and fear of being morally “bad.” Relationship stress appears to activate an abandonment network → panic → intrusive violent imagery; imagery is conceptualised in V4 as symbolic discharge of unprocessed attachment rage.</w:t>
       </w:r>
     </w:p>
     <w:p>
@@ -112,17 +124,32 @@
         <w:pStyle w:val="Heading1"/>
       </w:pPr>
       <w:r>
-        <w:t>Current presentation</w:t>
+        <w:t>Since Last Supervision</w:t>
       </w:r>
     </w:p>
     <w:p>
       <w:r>
-        <w:t>**[TO BE COMPLETED]** — Presentation updates since the 03 March 2026 summary, if any, once verified.</w:t>
+        <w:t xml:space="preserve">The most recent supervision-oriented case summary on file is </w:t>
+      </w:r>
+      <w:r>
+        <w:rPr>
+          <w:b/>
+        </w:rPr>
+        <w:t>V4 — 03 March 2026</w:t>
+      </w:r>
+      <w:r>
+        <w:t>.</w:t>
       </w:r>
     </w:p>
     <w:p>
       <w:r>
-        <w:t>*Documented baseline (V4, 03-03-2026):* University student; relationship instability, panic attacks, overthinking; intrusive violent imagery (ego-dystonic; no intent); awaiting GP referral to Brandon Centre; CORE = 18 (sleep elevated situationally).</w:t>
+        <w:rPr>
+          <w:b/>
+        </w:rPr>
+        <w:t>[TO BE COMPLETED]</w:t>
+      </w:r>
+      <w:r>
+        <w:t xml:space="preserve"> — Verified material dated after 03 March 2026, once added to the clinical record.</w:t>
       </w:r>
     </w:p>
     <w:p>
@@ -130,7 +157,31 @@
         <w:pStyle w:val="Heading1"/>
       </w:pPr>
       <w:r>
-        <w:t>Risk update</w:t>
+        <w:t>Current Presentation</w:t>
+      </w:r>
+    </w:p>
+    <w:p>
+      <w:r>
+        <w:t>*As documented in V4 (03-03-2026):* presentation includes university-level study with relationship instability, panic attacks, overthinking; intrusive violent imagery (ego-dystonic; no intent); await GP referral to Brandon Centre; CORE = 18 (sleep elevated situationally).</w:t>
+      </w:r>
+    </w:p>
+    <w:p>
+      <w:r>
+        <w:rPr>
+          <w:b/>
+        </w:rPr>
+        <w:t>[TO BE COMPLETED]</w:t>
+      </w:r>
+      <w:r>
+        <w:t xml:space="preserve"> — Any update to presentation since V4, once verified.</w:t>
+      </w:r>
+    </w:p>
+    <w:p>
+      <w:pPr>
+        <w:pStyle w:val="Heading1"/>
+      </w:pPr>
+      <w:r>
+        <w:t>Risk Update</w:t>
       </w:r>
     </w:p>
     <w:p>
@@ -138,7 +189,7 @@
         <w:rPr>
           <w:i/>
         </w:rPr>
-        <w:t>As documented in V4 (03-03-2026):</w:t>
+        <w:t>Per V4 (03-03-2026):</w:t>
       </w:r>
     </w:p>
     <w:p>
@@ -146,7 +197,7 @@
         <w:pStyle w:val="ListBullet"/>
       </w:pPr>
       <w:r>
-        <w:t>Denies intent to harm self or others.</w:t>
+        <w:t>Denies intent to harm self or others; would attend A&amp;E if thoughts escalate.</w:t>
       </w:r>
     </w:p>
     <w:p>
@@ -154,7 +205,7 @@
         <w:pStyle w:val="ListBullet"/>
       </w:pPr>
       <w:r>
-        <w:t>Would attend A&amp;E if thoughts escalate.</w:t>
+        <w:t>Insight remains described as intact; thoughts experienced as unwanted and distressing.</w:t>
       </w:r>
     </w:p>
     <w:p>
@@ -162,7 +213,45 @@
         <w:pStyle w:val="ListBullet"/>
       </w:pPr>
       <w:r>
-        <w:t>Insight intact; thoughts experienced as unwanted and distressing.</w:t>
+        <w:t>Protective factors on file include active help-seeking and engagement in therapy.</w:t>
+      </w:r>
+    </w:p>
+    <w:p>
+      <w:r>
+        <w:rPr>
+          <w:b/>
+        </w:rPr>
+        <w:t>[TO BE COMPLETED]</w:t>
+      </w:r>
+      <w:r>
+        <w:t xml:space="preserve"> — Any change in risk or protective factors since V4, once verified.</w:t>
+      </w:r>
+    </w:p>
+    <w:p>
+      <w:pPr>
+        <w:pStyle w:val="Heading1"/>
+      </w:pPr>
+      <w:r>
+        <w:t>EMDR Focus / Formulation Update</w:t>
+      </w:r>
+    </w:p>
+    <w:p>
+      <w:r>
+        <w:rPr>
+          <w:b/>
+        </w:rPr>
+        <w:t>Phase 2 work completed (per V4):</w:t>
+      </w:r>
+      <w:r>
+        <w:t xml:space="preserve"> Psychoeducation (panic physiology); breathing regulation and calming imagery; cognitive distortions (personalising, regret orientation); Inner Critic framework; intersession thought-monitoring task.</w:t>
+      </w:r>
+    </w:p>
+    <w:p>
+      <w:r>
+        <w:rPr>
+          <w:b/>
+        </w:rPr>
+        <w:t>Supervision feedback recorded in V4:</w:t>
       </w:r>
     </w:p>
     <w:p>
@@ -170,12 +259,77 @@
         <w:pStyle w:val="ListBullet"/>
       </w:pPr>
       <w:r>
-        <w:t>Protective factor: active help-seeking and engagement in therapy.</w:t>
+        <w:rPr>
+          <w:b/>
+        </w:rPr>
+        <w:t>Floatback:</w:t>
+      </w:r>
+      <w:r>
+        <w:t xml:space="preserve"> Trace NC “I am bad” to earliest memory; prioritise experiential link over narrative.</w:t>
+      </w:r>
+    </w:p>
+    <w:p>
+      <w:pPr>
+        <w:pStyle w:val="ListBullet"/>
+      </w:pPr>
+      <w:r>
+        <w:rPr>
+          <w:b/>
+        </w:rPr>
+        <w:t>NC “I am bad”:</w:t>
+      </w:r>
+      <w:r>
+        <w:t xml:space="preserve"> Core shame cognition; likely rooted in early attachment rupture and invalidation; target before or alongside abandonment memories.</w:t>
+      </w:r>
+    </w:p>
+    <w:p>
+      <w:pPr>
+        <w:pStyle w:val="ListBullet"/>
+      </w:pPr>
+      <w:r>
+        <w:rPr>
+          <w:b/>
+        </w:rPr>
+        <w:t>Ego-dystonic vs ego-syntonic:</w:t>
+      </w:r>
+      <w:r>
+        <w:t xml:space="preserve"> Intrusions are ego-dystonic (unwanted, distressing; no intent to act); distinct from ego-syntonic violent ideation (which would contraindicate EMDR).</w:t>
+      </w:r>
+    </w:p>
+    <w:p>
+      <w:pPr>
+        <w:pStyle w:val="ListBullet"/>
+      </w:pPr>
+      <w:r>
+        <w:rPr>
+          <w:b/>
+        </w:rPr>
+        <w:t>Timestamp vs present trauma:</w:t>
+      </w:r>
+      <w:r>
+        <w:t xml:space="preserve"> Clarify whether imagery reflects past (stored trauma) or present (ongoing threat); informs target selection and stabilisation.</w:t>
       </w:r>
     </w:p>
     <w:p>
       <w:r>
-        <w:t>**[TO BE COMPLETED]** — Any change in risk presentation or protective factors since last verified documentation.</w:t>
+        <w:rPr>
+          <w:b/>
+        </w:rPr>
+        <w:t>Treatment direction (branching logic, per V4):</w:t>
+      </w:r>
+      <w:r>
+        <w:t xml:space="preserve"> If intrusions are framed as past trauma → earliest linked memory via Floatback, process abandonment/shame sequence, extend stabilisation if affect tolerance is low. If present/future threat → strengthen Phase 2; target recent panic/disclosure memory first; future template after past processing as appropriate. If mixed/unclear → Floatback to clarify; prioritise earliest “I am bad” memory; reassess after processing that target.</w:t>
+      </w:r>
+    </w:p>
+    <w:p>
+      <w:r>
+        <w:rPr>
+          <w:b/>
+        </w:rPr>
+        <w:t>[TO BE COMPLETED]</w:t>
+      </w:r>
+      <w:r>
+        <w:t xml:space="preserve"> — Any formulation or phase update after V4, once verified.</w:t>
       </w:r>
     </w:p>
     <w:p>
@@ -183,7 +337,53 @@
         <w:pStyle w:val="Heading1"/>
       </w:pPr>
       <w:r>
-        <w:t>EMDR focus / formulation update</w:t>
+        <w:t>Questions for Supervision</w:t>
+      </w:r>
+    </w:p>
+    <w:p>
+      <w:r>
+        <w:rPr>
+          <w:b/>
+        </w:rPr>
+        <w:t>[TO BE COMPLETED]</w:t>
+      </w:r>
+      <w:r>
+        <w:t xml:space="preserve"> — New questions for the next supervision contact.</w:t>
+      </w:r>
+    </w:p>
+    <w:p>
+      <w:r>
+        <w:rPr>
+          <w:b/>
+        </w:rPr>
+        <w:t>Continuity (from supervision feedback in V4):</w:t>
+      </w:r>
+      <w:r>
+        <w:t xml:space="preserve"> Floatback and NC “I am bad”; ego-dystonic vs ego-syntonic framing; distinction between past-stored and present-threat material for targets and stabilisation.</w:t>
+      </w:r>
+    </w:p>
+    <w:p>
+      <w:pPr>
+        <w:pStyle w:val="Heading1"/>
+      </w:pPr>
+      <w:r>
+        <w:t>Next Steps</w:t>
+      </w:r>
+    </w:p>
+    <w:p>
+      <w:r>
+        <w:t>Follow V4 branching logic according to how intrusion type is conceptualised (past stored vs present/future threat vs mixed).</w:t>
+      </w:r>
+    </w:p>
+    <w:p>
+      <w:r>
+        <w:rPr>
+          <w:b/>
+        </w:rPr>
+        <w:t>[TO BE COMPLETED]</w:t>
+      </w:r>
+      <w:r>
+        <w:t xml:space="preserve"> — Agreed next steps once supervision is held and recorded.</w:t>
       </w:r>
     </w:p>
     <w:p>
@@ -191,144 +391,7 @@
         <w:rPr>
           <w:i/>
         </w:rPr>
-        <w:t>As documented in V4 (03-03-2026):</w:t>
-      </w:r>
-    </w:p>
-    <w:p>
-      <w:r>
-        <w:t>**Formulation (condensed attachment model):**</w:t>
-      </w:r>
-    </w:p>
-    <w:p>
-      <w:pPr>
-        <w:pStyle w:val="ListBullet"/>
-      </w:pPr>
-      <w:r>
-        <w:t>Father left when client was in Year 2 (attachment rupture).</w:t>
-      </w:r>
-    </w:p>
-    <w:p>
-      <w:pPr>
-        <w:pStyle w:val="ListBullet"/>
-      </w:pPr>
-      <w:r>
-        <w:t>Perceived emotional invalidation from mother (RADA choice).</w:t>
-      </w:r>
-    </w:p>
-    <w:p>
-      <w:pPr>
-        <w:pStyle w:val="ListBullet"/>
-      </w:pPr>
-      <w:r>
-        <w:t>Childhood sibling conflict/bullying experiences.</w:t>
-      </w:r>
-    </w:p>
-    <w:p>
-      <w:pPr>
-        <w:pStyle w:val="ListBullet"/>
-      </w:pPr>
-      <w:r>
-        <w:t>Suppressed rage linked to abandonment themes; shame about anger and fear of being morally “bad”.</w:t>
-      </w:r>
-    </w:p>
-    <w:p>
-      <w:pPr>
-        <w:pStyle w:val="ListBullet"/>
-      </w:pPr>
-      <w:r>
-        <w:t>Relationship stress activates abandonment network → panic → intrusive violent imagery; violent imagery conceptualised as symbolic discharge of unprocessed attachment rage.</w:t>
-      </w:r>
-    </w:p>
-    <w:p>
-      <w:r>
-        <w:t>**Phase 2 work completed (per V4):**</w:t>
-      </w:r>
-    </w:p>
-    <w:p>
-      <w:pPr>
-        <w:pStyle w:val="ListBullet"/>
-      </w:pPr>
-      <w:r>
-        <w:t>Psychoeducation on panic physiology.</w:t>
-      </w:r>
-    </w:p>
-    <w:p>
-      <w:pPr>
-        <w:pStyle w:val="ListBullet"/>
-      </w:pPr>
-      <w:r>
-        <w:t>Breathing regulation and calming imagery.</w:t>
-      </w:r>
-    </w:p>
-    <w:p>
-      <w:pPr>
-        <w:pStyle w:val="ListBullet"/>
-      </w:pPr>
-      <w:r>
-        <w:t>Cognitive distortions identified (personalising, regret orientation).</w:t>
-      </w:r>
-    </w:p>
-    <w:p>
-      <w:pPr>
-        <w:pStyle w:val="ListBullet"/>
-      </w:pPr>
-      <w:r>
-        <w:t>Inner Critic framework introduced.</w:t>
-      </w:r>
-    </w:p>
-    <w:p>
-      <w:pPr>
-        <w:pStyle w:val="ListBullet"/>
-      </w:pPr>
-      <w:r>
-        <w:t>Intersession thought-monitoring task assigned.</w:t>
-      </w:r>
-    </w:p>
-    <w:p>
-      <w:r>
-        <w:t>**Supervision feedback recorded in V4:**</w:t>
-      </w:r>
-    </w:p>
-    <w:p>
-      <w:pPr>
-        <w:pStyle w:val="ListBullet"/>
-      </w:pPr>
-      <w:r>
-        <w:t>Floatback: trace NC “I am bad” to earliest memory; prioritise experiential link over narrative.</w:t>
-      </w:r>
-    </w:p>
-    <w:p>
-      <w:pPr>
-        <w:pStyle w:val="ListBullet"/>
-      </w:pPr>
-      <w:r>
-        <w:t>NC “I am bad”: core shame cognition; likely rooted in early attachment rupture and invalidation; target before or alongside abandonment memories.</w:t>
-      </w:r>
-    </w:p>
-    <w:p>
-      <w:pPr>
-        <w:pStyle w:val="ListBullet"/>
-      </w:pPr>
-      <w:r>
-        <w:t>Ego-dystonic vs ego-syntonic clarification for intrusions.</w:t>
-      </w:r>
-    </w:p>
-    <w:p>
-      <w:pPr>
-        <w:pStyle w:val="ListBullet"/>
-      </w:pPr>
-      <w:r>
-        <w:t>Timestamp vs present trauma distinction for target selection and stabilisation.</w:t>
-      </w:r>
-    </w:p>
-    <w:p>
-      <w:r>
-        <w:t>**Treatment direction (branching logic in V4):** Depends on whether intrusions are framed as past (stored), present/future threat, or mixed; use Floatback to clarify where indicated.</w:t>
-      </w:r>
-    </w:p>
-    <w:p>
-      <w:r>
-        <w:t>**[TO BE COMPLETED]** — Any formulation or phase update since V4 once verified in repository materials.</w:t>
+        <w:t>V4 placeholder fields for future supervision dates remain unspecified on file.</w:t>
       </w:r>
     </w:p>
     <w:p>
@@ -336,40 +399,18 @@
         <w:pStyle w:val="Heading1"/>
       </w:pPr>
       <w:r>
-        <w:t>Questions for supervision with Dr Hannah Bryan</w:t>
+        <w:t>Compliance note</w:t>
       </w:r>
     </w:p>
     <w:p>
       <w:r>
-        <w:t>**[TO BE COMPLETED]** — New questions for this contact. (V4 records supervision feedback and treatment direction but does not list explicit session questions for a subsequent date.)</w:t>
+        <w:rPr>
+          <w:b/>
+        </w:rPr>
+        <w:t>No supervision session on 14 April 2026 is documented in the verified source used for this note (V4, 03-03-2026).</w:t>
       </w:r>
-    </w:p>
-    <w:p>
       <w:r>
-        <w:t>*Continuity topics already documented in V4 for reference:* Floatback and NC “I am bad”; ego-dystonic vs ego-syntonic clarity; past vs present/future threat and target selection.</w:t>
-      </w:r>
-    </w:p>
-    <w:p>
-      <w:pPr>
-        <w:pStyle w:val="Heading1"/>
-      </w:pPr>
-      <w:r>
-        <w:t>Next steps</w:t>
-      </w:r>
-    </w:p>
-    <w:p>
-      <w:r>
-        <w:t>Per V4, next steps depend on clarification of intrusion type (past trauma vs present/future threat vs mixed) and use of Floatback as outlined.</w:t>
-      </w:r>
-    </w:p>
-    <w:p>
-      <w:r>
-        <w:t>**[TO BE COMPLETED]** — Agreed actions following this supervision contact.</w:t>
-      </w:r>
-    </w:p>
-    <w:p>
-      <w:r>
-        <w:t>*V4 source placeholders:* Next supervision dates were not set in the on-file summary (`[Add next supervision date]` / `[Add following supervision date]`).</w:t>
+        <w:t xml:space="preserve"> This file is a structured supervision note for professional use; it does not assert that a meeting occurred on this date. Clinical content is limited to material evidenced in V4.</w:t>
       </w:r>
     </w:p>
     <w:sectPr>

</xml_diff>